<commit_message>
backup: tự động 21/10/2026 21:00 (121 tệp)
</commit_message>
<xml_diff>
--- a/30-Ket-Qua/2026-09-29/Soan-Thao-VB/QD-KHLCNT-giai-doan-CBDT_Du-an-CLC-2026-2030_20260929_v4.docx
+++ b/30-Ket-Qua/2026-09-29/Soan-Thao-VB/QD-KHLCNT-giai-doan-CBDT_Du-an-CLC-2026-2030_20260929_v4.docx
@@ -141,7 +141,7 @@
                     </wp:anchor>
                   </w:drawing>
                 </mc:Choice>
-                <mc:Fallback xmlns:w16sdtfl="http://schemas.microsoft.com/office/word/2024/wordml/sdtformatlock" xmlns:w16cei="http://schemas.microsoft.com/office/word/2026/wordml/cei">
+                <mc:Fallback xmlns:w16cei="http://schemas.microsoft.com/office/word/2026/wordml/cei" xmlns:w16sdtfl="http://schemas.microsoft.com/office/word/2024/wordml/sdtformatlock">
                   <w:pict>
                     <v:line w14:anchorId="385D0A79" id="Line 32" o:spid="_x0000_s1026" style="position:absolute;z-index:251696640;visibility:visible;mso-wrap-style:square;mso-width-percent:0;mso-height-percent:0;mso-wrap-distance-left:9pt;mso-wrap-distance-top:0;mso-wrap-distance-right:9pt;mso-wrap-distance-bottom:0;mso-position-horizontal:absolute;mso-position-horizontal-relative:text;mso-position-vertical:absolute;mso-position-vertical-relative:text;mso-width-percent:0;mso-height-percent:0;mso-width-relative:page;mso-height-relative:page" from="64.3pt,1.9pt" to="132.15pt,1.9pt" o:gfxdata="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"/>
                   </w:pict>
@@ -326,7 +326,7 @@
                     </wp:anchor>
                   </w:drawing>
                 </mc:Choice>
-                <mc:Fallback xmlns:w16sdtfl="http://schemas.microsoft.com/office/word/2024/wordml/sdtformatlock" xmlns:w16cei="http://schemas.microsoft.com/office/word/2026/wordml/cei">
+                <mc:Fallback xmlns:w16cei="http://schemas.microsoft.com/office/word/2026/wordml/cei" xmlns:w16sdtfl="http://schemas.microsoft.com/office/word/2024/wordml/sdtformatlock">
                   <w:pict>
                     <v:line w14:anchorId="660AC9F6" id="Line 31" o:spid="_x0000_s1026" style="position:absolute;z-index:251695616;visibility:visible;mso-wrap-style:square;mso-width-percent:0;mso-height-percent:0;mso-wrap-distance-left:9pt;mso-wrap-distance-top:0;mso-wrap-distance-right:9pt;mso-wrap-distance-bottom:0;mso-position-horizontal:absolute;mso-position-horizontal-relative:text;mso-position-vertical:absolute;mso-position-vertical-relative:text;mso-width-percent:0;mso-height-percent:0;mso-width-relative:page;mso-height-relative:page" from="51.3pt,-.35pt" to="223.3pt,-.35pt" o:gfxdata="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"/>
                   </w:pict>
@@ -340,7 +340,43 @@
                 <w:sz w:val="28"/>
                 <w:szCs w:val="26"/>
               </w:rPr>
-              <w:t>Quảng Ngãi, ngày 29 tháng 9 năm 2026</w:t>
+              <w:t xml:space="preserve">Quảng Ngãi, ngày </w:t>
+            </w:r>
+            <w:r>
+              <w:rPr>
+                <w:bCs/>
+                <w:i/>
+                <w:sz w:val="28"/>
+                <w:szCs w:val="26"/>
+              </w:rPr>
+              <w:t>07</w:t>
+            </w:r>
+            <w:r>
+              <w:rPr>
+                <w:bCs/>
+                <w:i/>
+                <w:sz w:val="28"/>
+                <w:szCs w:val="26"/>
+              </w:rPr>
+              <w:t xml:space="preserve"> tháng </w:t>
+            </w:r>
+            <w:r>
+              <w:rPr>
+                <w:bCs/>
+                <w:i/>
+                <w:sz w:val="28"/>
+                <w:szCs w:val="26"/>
+              </w:rPr>
+              <w:t>10</w:t>
+            </w:r>
+            <w:r>
+              <w:rPr>
+                <w:bCs/>
+                <w:i/>
+                <w:sz w:val="28"/>
+                <w:szCs w:val="26"/>
+              </w:rPr>
+              <w:t xml:space="preserve"> năm 2026</w:t>
             </w:r>
           </w:p>
         </w:tc>
@@ -490,7 +526,7 @@
               </wp:anchor>
             </w:drawing>
           </mc:Choice>
-          <mc:Fallback xmlns:w16sdtfl="http://schemas.microsoft.com/office/word/2024/wordml/sdtformatlock" xmlns:w16cei="http://schemas.microsoft.com/office/word/2026/wordml/cei">
+          <mc:Fallback xmlns:w16cei="http://schemas.microsoft.com/office/word/2026/wordml/cei" xmlns:w16sdtfl="http://schemas.microsoft.com/office/word/2024/wordml/sdtformatlock">
             <w:pict>
               <v:line w14:anchorId="4E03C82E" id="Straight Connector 10" o:spid="_x0000_s1026" style="position:absolute;z-index:251681280;visibility:visible;mso-wrap-style:square;mso-width-percent:0;mso-height-percent:0;mso-wrap-distance-left:9pt;mso-wrap-distance-top:0;mso-wrap-distance-right:9pt;mso-wrap-distance-bottom:0;mso-position-horizontal:absolute;mso-position-horizontal-relative:text;mso-position-vertical:absolute;mso-position-vertical-relative:text;mso-width-percent:0;mso-height-percent:0;mso-width-relative:margin;mso-height-relative:margin" from="182.95pt,3.3pt" to="268.45pt,3.3pt" o:gfxdata="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" strokecolor="black">
                 <v:stroke joinstyle="miter"/>
@@ -2649,7 +2685,7 @@
                 <w:szCs w:val="26"/>
                 <w:highlight w:val="yellow"/>
               </w:rPr>
-              <w:t>Khảo sát địa hình, địa chất phục vụ</w:t>
+              <w:t>Khảo sát phục vụ</w:t>
             </w:r>
             <w:r>
               <w:rPr>
@@ -3773,10 +3809,19 @@
       </w:pPr>
       <w:r>
         <w:rPr>
-          <w:sz w:val="28"/>
-          <w:szCs w:val="28"/>
-        </w:rPr>
-        <w:t>Ghi chú: (*) Vốn đầu tư thuộc Chương trình mục tiêu quốc gia xây dựng nông thôn mới, giảm nghèo bền vững và phát triển kinh tế - xã hội vùng đồng bào dân tộc thiểu số và miền núi giai đoạn 2026 - 2035, giai đoạn I: từ năm 2026 đến năm 2030; cơ cấu ngân sách trung ương/ngân sách tỉnh theo kế hoạch vốn do cấp có thẩm quyền giao. Tổng giá trị 3 gói thầu tại bảng trên bằng đúng dự toán kinh phí chuẩn bị đầu tư đã phê duyệt tại khoản 6 Điều 1: 1.519.778.268 đồng. Cả 3 gói áp dụng chỉ định thầu theo quy trình rút gọn nên không bắt buộc lập, thẩm định hồ sơ yêu cầu/hồ sơ mời thầu riêng (Nghị định số 214/2025/NĐ-CP).</w:t>
+          <w:b/>
+          <w:bCs/>
+          <w:sz w:val="28"/>
+          <w:szCs w:val="28"/>
+        </w:rPr>
+        <w:t>Ghi chú: (*)</w:t>
+      </w:r>
+      <w:r>
+        <w:rPr>
+          <w:sz w:val="28"/>
+          <w:szCs w:val="28"/>
+        </w:rPr>
+        <w:t xml:space="preserve"> Vốn đầu tư thuộc Chương trình mục tiêu quốc gia xây dựng nông thôn mới, giảm nghèo bền vững và phát triển kinh tế - xã hội vùng đồng bào dân tộc thiểu số và miền núi giai đoạn 2026 - 2035, giai đoạn I: từ năm 2026 đến năm 2030; cơ cấu ngân sách trung ương/ngân sách tỉnh theo kế hoạch vốn do cấp có thẩm quyền giao. Tổng giá trị 3 gói thầu tại bảng trên bằng đúng dự toán kinh phí chuẩn bị đầu tư đã phê duyệt tại khoản 6 Điều 1: 1.519.778.268 đồng. Cả 3 gói áp dụng chỉ định thầu theo quy trình rút gọn nên không bắt buộc lập, thẩm định hồ sơ yêu cầu/hồ sơ mời thầu riêng (Nghị định số 214/2025/NĐ-CP).</w:t>
       </w:r>
     </w:p>
     <w:sectPr>

</xml_diff>